<commit_message>
Add one-letter command aliases for all commands
Each command now has a single-character shortcut (c=connect, s=stream,
f=filter, /=search, k=callbook, u=lookup, t=status, etc.).  Aliases are
registered in the dispatch table, included in tab-completion, and shown
in the help summary with [alias] notation.  'help <alias>' works the same
as 'help <full-command>'.  User manual updated with a Section 13 Quick
Reference Card showing all aliases and keyboard shortcuts.

https://claude.ai/code/session_019fNDhhkDtvNfBzqoqBhGQm
</commit_message>
<xml_diff>
--- a/DXClusterSpots_User_Manual.docx
+++ b/DXClusterSpots_User_Manual.docx
@@ -10674,6 +10674,1552 @@
         <w:t>Any relevant output from the terminal</w:t>
       </w:r>
     </w:p>
+    <w:p>
+      <w:r>
+        <w:br w:type="page"/>
+      </w:r>
+    </w:p>
+    <w:p>
+      <w:pPr>
+        <w:pStyle w:val="Heading1"/>
+        <w:spacing w:before="240" w:after="80"/>
+      </w:pPr>
+      <w:r>
+        <w:t>13.  Quick Reference Card</w:t>
+      </w:r>
+    </w:p>
+    <w:p>
+      <w:pPr>
+        <w:spacing w:before="0" w:after="80"/>
+      </w:pPr>
+      <w:r>
+        <w:rPr>
+          <w:rFonts w:ascii="Calibri" w:hAnsi="Calibri"/>
+          <w:sz w:val="22"/>
+        </w:rPr>
+        <w:t>Every command has a one-character alias for fast entry. Type the alias exactly as shown — the same arguments apply as for the full command name. For example, f band 20m is identical to filter band 20m.</w:t>
+      </w:r>
+    </w:p>
+    <w:tbl>
+      <w:tblPr>
+        <w:tblStyle w:val="TableGrid"/>
+        <w:tblW w:type="auto" w:w="0"/>
+        <w:tblLook w:firstColumn="1" w:firstRow="1" w:lastColumn="0" w:lastRow="0" w:noHBand="0" w:noVBand="1" w:val="04A0"/>
+      </w:tblPr>
+      <w:tblGrid>
+        <w:gridCol w:w="2351"/>
+        <w:gridCol w:w="2351"/>
+        <w:gridCol w:w="2351"/>
+        <w:gridCol w:w="2351"/>
+      </w:tblGrid>
+      <w:tr>
+        <w:tc>
+          <w:tcPr>
+            <w:tcW w:type="dxa" w:w="850"/>
+          </w:tcPr>
+          <w:p>
+            <w:pPr>
+              <w:shd w:val="clear" w:color="auto" w:fill="BDD7EE"/>
+            </w:pPr>
+            <w:r>
+              <w:rPr>
+                <w:rFonts w:ascii="Calibri" w:hAnsi="Calibri"/>
+                <w:b/>
+                <w:sz w:val="20"/>
+              </w:rPr>
+              <w:t>Alias</w:t>
+            </w:r>
+          </w:p>
+        </w:tc>
+        <w:tc>
+          <w:tcPr>
+            <w:tcW w:type="dxa" w:w="1701"/>
+          </w:tcPr>
+          <w:p>
+            <w:pPr>
+              <w:shd w:val="clear" w:color="auto" w:fill="BDD7EE"/>
+            </w:pPr>
+            <w:r>
+              <w:rPr>
+                <w:rFonts w:ascii="Calibri" w:hAnsi="Calibri"/>
+                <w:b/>
+                <w:sz w:val="20"/>
+              </w:rPr>
+              <w:t>Full command</w:t>
+            </w:r>
+          </w:p>
+        </w:tc>
+        <w:tc>
+          <w:tcPr>
+            <w:tcW w:type="dxa" w:w="2551"/>
+          </w:tcPr>
+          <w:p>
+            <w:pPr>
+              <w:shd w:val="clear" w:color="auto" w:fill="BDD7EE"/>
+            </w:pPr>
+            <w:r>
+              <w:rPr>
+                <w:rFonts w:ascii="Calibri" w:hAnsi="Calibri"/>
+                <w:b/>
+                <w:sz w:val="20"/>
+              </w:rPr>
+              <w:t>Arguments</w:t>
+            </w:r>
+          </w:p>
+        </w:tc>
+        <w:tc>
+          <w:tcPr>
+            <w:tcW w:type="dxa" w:w="3969"/>
+          </w:tcPr>
+          <w:p>
+            <w:pPr>
+              <w:shd w:val="clear" w:color="auto" w:fill="BDD7EE"/>
+            </w:pPr>
+            <w:r>
+              <w:rPr>
+                <w:rFonts w:ascii="Calibri" w:hAnsi="Calibri"/>
+                <w:b/>
+                <w:sz w:val="20"/>
+              </w:rPr>
+              <w:t>Description</w:t>
+            </w:r>
+          </w:p>
+        </w:tc>
+      </w:tr>
+      <w:tr>
+        <w:tc>
+          <w:tcPr>
+            <w:tcW w:type="dxa" w:w="850"/>
+          </w:tcPr>
+          <w:p>
+            <w:r>
+              <w:rPr>
+                <w:rFonts w:ascii="Courier New" w:hAnsi="Courier New"/>
+                <w:sz w:val="18"/>
+              </w:rPr>
+              <w:t>h</w:t>
+            </w:r>
+          </w:p>
+        </w:tc>
+        <w:tc>
+          <w:tcPr>
+            <w:tcW w:type="dxa" w:w="1701"/>
+          </w:tcPr>
+          <w:p>
+            <w:r>
+              <w:rPr>
+                <w:rFonts w:ascii="Courier New" w:hAnsi="Courier New"/>
+                <w:sz w:val="18"/>
+              </w:rPr>
+              <w:t>help</w:t>
+            </w:r>
+          </w:p>
+        </w:tc>
+        <w:tc>
+          <w:tcPr>
+            <w:tcW w:type="dxa" w:w="2551"/>
+          </w:tcPr>
+          <w:p>
+            <w:r>
+              <w:rPr>
+                <w:rFonts w:ascii="Courier New" w:hAnsi="Courier New"/>
+                <w:sz w:val="18"/>
+              </w:rPr>
+              <w:t>[command]</w:t>
+            </w:r>
+          </w:p>
+        </w:tc>
+        <w:tc>
+          <w:tcPr>
+            <w:tcW w:type="dxa" w:w="3969"/>
+          </w:tcPr>
+          <w:p>
+            <w:r>
+              <w:rPr>
+                <w:rFonts w:ascii="Calibri" w:hAnsi="Calibri"/>
+                <w:sz w:val="20"/>
+              </w:rPr>
+              <w:t>Show command list or detailed help</w:t>
+            </w:r>
+          </w:p>
+        </w:tc>
+      </w:tr>
+      <w:tr>
+        <w:tc>
+          <w:tcPr>
+            <w:tcW w:type="dxa" w:w="850"/>
+          </w:tcPr>
+          <w:p>
+            <w:r>
+              <w:rPr>
+                <w:rFonts w:ascii="Courier New" w:hAnsi="Courier New"/>
+                <w:sz w:val="18"/>
+              </w:rPr>
+              <w:t>c</w:t>
+            </w:r>
+          </w:p>
+        </w:tc>
+        <w:tc>
+          <w:tcPr>
+            <w:tcW w:type="dxa" w:w="1701"/>
+          </w:tcPr>
+          <w:p>
+            <w:r>
+              <w:rPr>
+                <w:rFonts w:ascii="Courier New" w:hAnsi="Courier New"/>
+                <w:sz w:val="18"/>
+              </w:rPr>
+              <w:t>connect</w:t>
+            </w:r>
+          </w:p>
+        </w:tc>
+        <w:tc>
+          <w:tcPr>
+            <w:tcW w:type="dxa" w:w="2551"/>
+          </w:tcPr>
+          <w:p>
+            <w:r>
+              <w:rPr>
+                <w:rFonts w:ascii="Courier New" w:hAnsi="Courier New"/>
+                <w:sz w:val="18"/>
+              </w:rPr>
+              <w:t>&lt;node|host&gt; [call] [port]</w:t>
+            </w:r>
+          </w:p>
+        </w:tc>
+        <w:tc>
+          <w:tcPr>
+            <w:tcW w:type="dxa" w:w="3969"/>
+          </w:tcPr>
+          <w:p>
+            <w:r>
+              <w:rPr>
+                <w:rFonts w:ascii="Calibri" w:hAnsi="Calibri"/>
+                <w:sz w:val="20"/>
+              </w:rPr>
+              <w:t>Connect to a DX cluster node</w:t>
+            </w:r>
+          </w:p>
+        </w:tc>
+      </w:tr>
+      <w:tr>
+        <w:tc>
+          <w:tcPr>
+            <w:tcW w:type="dxa" w:w="850"/>
+          </w:tcPr>
+          <w:p>
+            <w:r>
+              <w:rPr>
+                <w:rFonts w:ascii="Courier New" w:hAnsi="Courier New"/>
+                <w:sz w:val="18"/>
+              </w:rPr>
+              <w:t>d</w:t>
+            </w:r>
+          </w:p>
+        </w:tc>
+        <w:tc>
+          <w:tcPr>
+            <w:tcW w:type="dxa" w:w="1701"/>
+          </w:tcPr>
+          <w:p>
+            <w:r>
+              <w:rPr>
+                <w:rFonts w:ascii="Courier New" w:hAnsi="Courier New"/>
+                <w:sz w:val="18"/>
+              </w:rPr>
+              <w:t>disconnect</w:t>
+            </w:r>
+          </w:p>
+        </w:tc>
+        <w:tc>
+          <w:tcPr>
+            <w:tcW w:type="dxa" w:w="2551"/>
+          </w:tcPr>
+          <w:p>
+            <w:r>
+              <w:rPr>
+                <w:rFonts w:ascii="Courier New" w:hAnsi="Courier New"/>
+                <w:sz w:val="18"/>
+              </w:rPr>
+            </w:r>
+          </w:p>
+        </w:tc>
+        <w:tc>
+          <w:tcPr>
+            <w:tcW w:type="dxa" w:w="3969"/>
+          </w:tcPr>
+          <w:p>
+            <w:r>
+              <w:rPr>
+                <w:rFonts w:ascii="Calibri" w:hAnsi="Calibri"/>
+                <w:sz w:val="20"/>
+              </w:rPr>
+              <w:t>Close the current connection</w:t>
+            </w:r>
+          </w:p>
+        </w:tc>
+      </w:tr>
+      <w:tr>
+        <w:tc>
+          <w:tcPr>
+            <w:tcW w:type="dxa" w:w="850"/>
+          </w:tcPr>
+          <w:p>
+            <w:r>
+              <w:rPr>
+                <w:rFonts w:ascii="Courier New" w:hAnsi="Courier New"/>
+                <w:sz w:val="18"/>
+              </w:rPr>
+              <w:t>n</w:t>
+            </w:r>
+          </w:p>
+        </w:tc>
+        <w:tc>
+          <w:tcPr>
+            <w:tcW w:type="dxa" w:w="1701"/>
+          </w:tcPr>
+          <w:p>
+            <w:r>
+              <w:rPr>
+                <w:rFonts w:ascii="Courier New" w:hAnsi="Courier New"/>
+                <w:sz w:val="18"/>
+              </w:rPr>
+              <w:t>nodes</w:t>
+            </w:r>
+          </w:p>
+        </w:tc>
+        <w:tc>
+          <w:tcPr>
+            <w:tcW w:type="dxa" w:w="2551"/>
+          </w:tcPr>
+          <w:p>
+            <w:r>
+              <w:rPr>
+                <w:rFonts w:ascii="Courier New" w:hAnsi="Courier New"/>
+                <w:sz w:val="18"/>
+              </w:rPr>
+            </w:r>
+          </w:p>
+        </w:tc>
+        <w:tc>
+          <w:tcPr>
+            <w:tcW w:type="dxa" w:w="3969"/>
+          </w:tcPr>
+          <w:p>
+            <w:r>
+              <w:rPr>
+                <w:rFonts w:ascii="Calibri" w:hAnsi="Calibri"/>
+                <w:sz w:val="20"/>
+              </w:rPr>
+              <w:t>List all known cluster nodes</w:t>
+            </w:r>
+          </w:p>
+        </w:tc>
+      </w:tr>
+      <w:tr>
+        <w:tc>
+          <w:tcPr>
+            <w:tcW w:type="dxa" w:w="850"/>
+          </w:tcPr>
+          <w:p>
+            <w:r>
+              <w:rPr>
+                <w:rFonts w:ascii="Courier New" w:hAnsi="Courier New"/>
+                <w:sz w:val="18"/>
+              </w:rPr>
+              <w:t>b</w:t>
+            </w:r>
+          </w:p>
+        </w:tc>
+        <w:tc>
+          <w:tcPr>
+            <w:tcW w:type="dxa" w:w="1701"/>
+          </w:tcPr>
+          <w:p>
+            <w:r>
+              <w:rPr>
+                <w:rFonts w:ascii="Courier New" w:hAnsi="Courier New"/>
+                <w:sz w:val="18"/>
+              </w:rPr>
+              <w:t>bands</w:t>
+            </w:r>
+          </w:p>
+        </w:tc>
+        <w:tc>
+          <w:tcPr>
+            <w:tcW w:type="dxa" w:w="2551"/>
+          </w:tcPr>
+          <w:p>
+            <w:r>
+              <w:rPr>
+                <w:rFonts w:ascii="Courier New" w:hAnsi="Courier New"/>
+                <w:sz w:val="18"/>
+              </w:rPr>
+            </w:r>
+          </w:p>
+        </w:tc>
+        <w:tc>
+          <w:tcPr>
+            <w:tcW w:type="dxa" w:w="3969"/>
+          </w:tcPr>
+          <w:p>
+            <w:r>
+              <w:rPr>
+                <w:rFonts w:ascii="Calibri" w:hAnsi="Calibri"/>
+                <w:sz w:val="20"/>
+              </w:rPr>
+              <w:t>Show the band plan</w:t>
+            </w:r>
+          </w:p>
+        </w:tc>
+      </w:tr>
+      <w:tr>
+        <w:tc>
+          <w:tcPr>
+            <w:tcW w:type="dxa" w:w="850"/>
+          </w:tcPr>
+          <w:p>
+            <w:r>
+              <w:rPr>
+                <w:rFonts w:ascii="Courier New" w:hAnsi="Courier New"/>
+                <w:sz w:val="18"/>
+              </w:rPr>
+              <w:t>s</w:t>
+            </w:r>
+          </w:p>
+        </w:tc>
+        <w:tc>
+          <w:tcPr>
+            <w:tcW w:type="dxa" w:w="1701"/>
+          </w:tcPr>
+          <w:p>
+            <w:r>
+              <w:rPr>
+                <w:rFonts w:ascii="Courier New" w:hAnsi="Courier New"/>
+                <w:sz w:val="18"/>
+              </w:rPr>
+              <w:t>stream</w:t>
+            </w:r>
+          </w:p>
+        </w:tc>
+        <w:tc>
+          <w:tcPr>
+            <w:tcW w:type="dxa" w:w="2551"/>
+          </w:tcPr>
+          <w:p>
+            <w:r>
+              <w:rPr>
+                <w:rFonts w:ascii="Courier New" w:hAnsi="Courier New"/>
+                <w:sz w:val="18"/>
+              </w:rPr>
+              <w:t>[start|stop]</w:t>
+            </w:r>
+          </w:p>
+        </w:tc>
+        <w:tc>
+          <w:tcPr>
+            <w:tcW w:type="dxa" w:w="3969"/>
+          </w:tcPr>
+          <w:p>
+            <w:r>
+              <w:rPr>
+                <w:rFonts w:ascii="Calibri" w:hAnsi="Calibri"/>
+                <w:sz w:val="20"/>
+              </w:rPr>
+              <w:t>Toggle live spot streaming</w:t>
+            </w:r>
+          </w:p>
+        </w:tc>
+      </w:tr>
+      <w:tr>
+        <w:tc>
+          <w:tcPr>
+            <w:tcW w:type="dxa" w:w="850"/>
+          </w:tcPr>
+          <w:p>
+            <w:r>
+              <w:rPr>
+                <w:rFonts w:ascii="Courier New" w:hAnsi="Courier New"/>
+                <w:sz w:val="18"/>
+              </w:rPr>
+              <w:t>f</w:t>
+            </w:r>
+          </w:p>
+        </w:tc>
+        <w:tc>
+          <w:tcPr>
+            <w:tcW w:type="dxa" w:w="1701"/>
+          </w:tcPr>
+          <w:p>
+            <w:r>
+              <w:rPr>
+                <w:rFonts w:ascii="Courier New" w:hAnsi="Courier New"/>
+                <w:sz w:val="18"/>
+              </w:rPr>
+              <w:t>filter</w:t>
+            </w:r>
+          </w:p>
+        </w:tc>
+        <w:tc>
+          <w:tcPr>
+            <w:tcW w:type="dxa" w:w="2551"/>
+          </w:tcPr>
+          <w:p>
+            <w:r>
+              <w:rPr>
+                <w:rFonts w:ascii="Courier New" w:hAnsi="Courier New"/>
+                <w:sz w:val="18"/>
+              </w:rPr>
+              <w:t>band|mode|zone|clear|show</w:t>
+            </w:r>
+          </w:p>
+        </w:tc>
+        <w:tc>
+          <w:tcPr>
+            <w:tcW w:type="dxa" w:w="3969"/>
+          </w:tcPr>
+          <w:p>
+            <w:r>
+              <w:rPr>
+                <w:rFonts w:ascii="Calibri" w:hAnsi="Calibri"/>
+                <w:sz w:val="20"/>
+              </w:rPr>
+              <w:t>Apply or remove spot filters</w:t>
+            </w:r>
+          </w:p>
+        </w:tc>
+      </w:tr>
+      <w:tr>
+        <w:tc>
+          <w:tcPr>
+            <w:tcW w:type="dxa" w:w="850"/>
+          </w:tcPr>
+          <w:p>
+            <w:r>
+              <w:rPr>
+                <w:rFonts w:ascii="Courier New" w:hAnsi="Courier New"/>
+                <w:sz w:val="18"/>
+              </w:rPr>
+              <w:t>w</w:t>
+            </w:r>
+          </w:p>
+        </w:tc>
+        <w:tc>
+          <w:tcPr>
+            <w:tcW w:type="dxa" w:w="1701"/>
+          </w:tcPr>
+          <w:p>
+            <w:r>
+              <w:rPr>
+                <w:rFonts w:ascii="Courier New" w:hAnsi="Courier New"/>
+                <w:sz w:val="18"/>
+              </w:rPr>
+              <w:t>worked</w:t>
+            </w:r>
+          </w:p>
+        </w:tc>
+        <w:tc>
+          <w:tcPr>
+            <w:tcW w:type="dxa" w:w="2551"/>
+          </w:tcPr>
+          <w:p>
+            <w:r>
+              <w:rPr>
+                <w:rFonts w:ascii="Courier New" w:hAnsi="Courier New"/>
+                <w:sz w:val="18"/>
+              </w:rPr>
+              <w:t>&lt;prefix …&gt;</w:t>
+            </w:r>
+          </w:p>
+        </w:tc>
+        <w:tc>
+          <w:tcPr>
+            <w:tcW w:type="dxa" w:w="3969"/>
+          </w:tcPr>
+          <w:p>
+            <w:r>
+              <w:rPr>
+                <w:rFonts w:ascii="Calibri" w:hAnsi="Calibri"/>
+                <w:sz w:val="20"/>
+              </w:rPr>
+              <w:t>Mark entity as worked (dim in display)</w:t>
+            </w:r>
+          </w:p>
+        </w:tc>
+      </w:tr>
+      <w:tr>
+        <w:tc>
+          <w:tcPr>
+            <w:tcW w:type="dxa" w:w="850"/>
+          </w:tcPr>
+          <w:p>
+            <w:r>
+              <w:rPr>
+                <w:rFonts w:ascii="Courier New" w:hAnsi="Courier New"/>
+                <w:sz w:val="18"/>
+              </w:rPr>
+              <w:t>i</w:t>
+            </w:r>
+          </w:p>
+        </w:tc>
+        <w:tc>
+          <w:tcPr>
+            <w:tcW w:type="dxa" w:w="1701"/>
+          </w:tcPr>
+          <w:p>
+            <w:r>
+              <w:rPr>
+                <w:rFonts w:ascii="Courier New" w:hAnsi="Courier New"/>
+                <w:sz w:val="18"/>
+              </w:rPr>
+              <w:t>include</w:t>
+            </w:r>
+          </w:p>
+        </w:tc>
+        <w:tc>
+          <w:tcPr>
+            <w:tcW w:type="dxa" w:w="2551"/>
+          </w:tcPr>
+          <w:p>
+            <w:r>
+              <w:rPr>
+                <w:rFonts w:ascii="Courier New" w:hAnsi="Courier New"/>
+                <w:sz w:val="18"/>
+              </w:rPr>
+              <w:t>&lt;prefix …&gt;</w:t>
+            </w:r>
+          </w:p>
+        </w:tc>
+        <w:tc>
+          <w:tcPr>
+            <w:tcW w:type="dxa" w:w="3969"/>
+          </w:tcPr>
+          <w:p>
+            <w:r>
+              <w:rPr>
+                <w:rFonts w:ascii="Calibri" w:hAnsi="Calibri"/>
+                <w:sz w:val="20"/>
+              </w:rPr>
+              <w:t>Show only spots from these prefixes</w:t>
+            </w:r>
+          </w:p>
+        </w:tc>
+      </w:tr>
+      <w:tr>
+        <w:tc>
+          <w:tcPr>
+            <w:tcW w:type="dxa" w:w="850"/>
+          </w:tcPr>
+          <w:p>
+            <w:r>
+              <w:rPr>
+                <w:rFonts w:ascii="Courier New" w:hAnsi="Courier New"/>
+                <w:sz w:val="18"/>
+              </w:rPr>
+              <w:t>e</w:t>
+            </w:r>
+          </w:p>
+        </w:tc>
+        <w:tc>
+          <w:tcPr>
+            <w:tcW w:type="dxa" w:w="1701"/>
+          </w:tcPr>
+          <w:p>
+            <w:r>
+              <w:rPr>
+                <w:rFonts w:ascii="Courier New" w:hAnsi="Courier New"/>
+                <w:sz w:val="18"/>
+              </w:rPr>
+              <w:t>exclude</w:t>
+            </w:r>
+          </w:p>
+        </w:tc>
+        <w:tc>
+          <w:tcPr>
+            <w:tcW w:type="dxa" w:w="2551"/>
+          </w:tcPr>
+          <w:p>
+            <w:r>
+              <w:rPr>
+                <w:rFonts w:ascii="Courier New" w:hAnsi="Courier New"/>
+                <w:sz w:val="18"/>
+              </w:rPr>
+              <w:t>&lt;prefix …&gt;</w:t>
+            </w:r>
+          </w:p>
+        </w:tc>
+        <w:tc>
+          <w:tcPr>
+            <w:tcW w:type="dxa" w:w="3969"/>
+          </w:tcPr>
+          <w:p>
+            <w:r>
+              <w:rPr>
+                <w:rFonts w:ascii="Calibri" w:hAnsi="Calibri"/>
+                <w:sz w:val="20"/>
+              </w:rPr>
+              <w:t>Hide spots from these prefixes</w:t>
+            </w:r>
+          </w:p>
+        </w:tc>
+      </w:tr>
+      <w:tr>
+        <w:tc>
+          <w:tcPr>
+            <w:tcW w:type="dxa" w:w="850"/>
+          </w:tcPr>
+          <w:p>
+            <w:r>
+              <w:rPr>
+                <w:rFonts w:ascii="Courier New" w:hAnsi="Courier New"/>
+                <w:sz w:val="18"/>
+              </w:rPr>
+              <w:t>/</w:t>
+            </w:r>
+          </w:p>
+        </w:tc>
+        <w:tc>
+          <w:tcPr>
+            <w:tcW w:type="dxa" w:w="1701"/>
+          </w:tcPr>
+          <w:p>
+            <w:r>
+              <w:rPr>
+                <w:rFonts w:ascii="Courier New" w:hAnsi="Courier New"/>
+                <w:sz w:val="18"/>
+              </w:rPr>
+              <w:t>search</w:t>
+            </w:r>
+          </w:p>
+        </w:tc>
+        <w:tc>
+          <w:tcPr>
+            <w:tcW w:type="dxa" w:w="2551"/>
+          </w:tcPr>
+          <w:p>
+            <w:r>
+              <w:rPr>
+                <w:rFonts w:ascii="Courier New" w:hAnsi="Courier New"/>
+                <w:sz w:val="18"/>
+              </w:rPr>
+              <w:t>freq|call|prefix &lt;value&gt;</w:t>
+            </w:r>
+          </w:p>
+        </w:tc>
+        <w:tc>
+          <w:tcPr>
+            <w:tcW w:type="dxa" w:w="3969"/>
+          </w:tcPr>
+          <w:p>
+            <w:r>
+              <w:rPr>
+                <w:rFonts w:ascii="Calibri" w:hAnsi="Calibri"/>
+                <w:sz w:val="20"/>
+              </w:rPr>
+              <w:t>Search 24-hour spot log</w:t>
+            </w:r>
+          </w:p>
+        </w:tc>
+      </w:tr>
+      <w:tr>
+        <w:tc>
+          <w:tcPr>
+            <w:tcW w:type="dxa" w:w="850"/>
+          </w:tcPr>
+          <w:p>
+            <w:r>
+              <w:rPr>
+                <w:rFonts w:ascii="Courier New" w:hAnsi="Courier New"/>
+                <w:sz w:val="18"/>
+              </w:rPr>
+              <w:t>l</w:t>
+            </w:r>
+          </w:p>
+        </w:tc>
+        <w:tc>
+          <w:tcPr>
+            <w:tcW w:type="dxa" w:w="1701"/>
+          </w:tcPr>
+          <w:p>
+            <w:r>
+              <w:rPr>
+                <w:rFonts w:ascii="Courier New" w:hAnsi="Courier New"/>
+                <w:sz w:val="18"/>
+              </w:rPr>
+              <w:t>log</w:t>
+            </w:r>
+          </w:p>
+        </w:tc>
+        <w:tc>
+          <w:tcPr>
+            <w:tcW w:type="dxa" w:w="2551"/>
+          </w:tcPr>
+          <w:p>
+            <w:r>
+              <w:rPr>
+                <w:rFonts w:ascii="Courier New" w:hAnsi="Courier New"/>
+                <w:sz w:val="18"/>
+              </w:rPr>
+            </w:r>
+          </w:p>
+        </w:tc>
+        <w:tc>
+          <w:tcPr>
+            <w:tcW w:type="dxa" w:w="3969"/>
+          </w:tcPr>
+          <w:p>
+            <w:r>
+              <w:rPr>
+                <w:rFonts w:ascii="Calibri" w:hAnsi="Calibri"/>
+                <w:sz w:val="20"/>
+              </w:rPr>
+              <w:t>Show spot log statistics</w:t>
+            </w:r>
+          </w:p>
+        </w:tc>
+      </w:tr>
+      <w:tr>
+        <w:tc>
+          <w:tcPr>
+            <w:tcW w:type="dxa" w:w="850"/>
+          </w:tcPr>
+          <w:p>
+            <w:r>
+              <w:rPr>
+                <w:rFonts w:ascii="Courier New" w:hAnsi="Courier New"/>
+                <w:sz w:val="18"/>
+              </w:rPr>
+              <w:t>t</w:t>
+            </w:r>
+          </w:p>
+        </w:tc>
+        <w:tc>
+          <w:tcPr>
+            <w:tcW w:type="dxa" w:w="1701"/>
+          </w:tcPr>
+          <w:p>
+            <w:r>
+              <w:rPr>
+                <w:rFonts w:ascii="Courier New" w:hAnsi="Courier New"/>
+                <w:sz w:val="18"/>
+              </w:rPr>
+              <w:t>status</w:t>
+            </w:r>
+          </w:p>
+        </w:tc>
+        <w:tc>
+          <w:tcPr>
+            <w:tcW w:type="dxa" w:w="2551"/>
+          </w:tcPr>
+          <w:p>
+            <w:r>
+              <w:rPr>
+                <w:rFonts w:ascii="Courier New" w:hAnsi="Courier New"/>
+                <w:sz w:val="18"/>
+              </w:rPr>
+            </w:r>
+          </w:p>
+        </w:tc>
+        <w:tc>
+          <w:tcPr>
+            <w:tcW w:type="dxa" w:w="3969"/>
+          </w:tcPr>
+          <w:p>
+            <w:r>
+              <w:rPr>
+                <w:rFonts w:ascii="Calibri" w:hAnsi="Calibri"/>
+                <w:sz w:val="20"/>
+              </w:rPr>
+              <w:t>Connection and filter summary</w:t>
+            </w:r>
+          </w:p>
+        </w:tc>
+      </w:tr>
+      <w:tr>
+        <w:tc>
+          <w:tcPr>
+            <w:tcW w:type="dxa" w:w="850"/>
+          </w:tcPr>
+          <w:p>
+            <w:r>
+              <w:rPr>
+                <w:rFonts w:ascii="Courier New" w:hAnsi="Courier New"/>
+                <w:sz w:val="18"/>
+              </w:rPr>
+              <w:t>j</w:t>
+            </w:r>
+          </w:p>
+        </w:tc>
+        <w:tc>
+          <w:tcPr>
+            <w:tcW w:type="dxa" w:w="1701"/>
+          </w:tcPr>
+          <w:p>
+            <w:r>
+              <w:rPr>
+                <w:rFonts w:ascii="Courier New" w:hAnsi="Courier New"/>
+                <w:sz w:val="18"/>
+              </w:rPr>
+              <w:t>json</w:t>
+            </w:r>
+          </w:p>
+        </w:tc>
+        <w:tc>
+          <w:tcPr>
+            <w:tcW w:type="dxa" w:w="2551"/>
+          </w:tcPr>
+          <w:p>
+            <w:r>
+              <w:rPr>
+                <w:rFonts w:ascii="Courier New" w:hAnsi="Courier New"/>
+                <w:sz w:val="18"/>
+              </w:rPr>
+              <w:t>[on|off]</w:t>
+            </w:r>
+          </w:p>
+        </w:tc>
+        <w:tc>
+          <w:tcPr>
+            <w:tcW w:type="dxa" w:w="3969"/>
+          </w:tcPr>
+          <w:p>
+            <w:r>
+              <w:rPr>
+                <w:rFonts w:ascii="Calibri" w:hAnsi="Calibri"/>
+                <w:sz w:val="20"/>
+              </w:rPr>
+              <w:t>Toggle NDJSON output to stdout</w:t>
+            </w:r>
+          </w:p>
+        </w:tc>
+      </w:tr>
+      <w:tr>
+        <w:tc>
+          <w:tcPr>
+            <w:tcW w:type="dxa" w:w="850"/>
+          </w:tcPr>
+          <w:p>
+            <w:r>
+              <w:rPr>
+                <w:rFonts w:ascii="Courier New" w:hAnsi="Courier New"/>
+                <w:sz w:val="18"/>
+              </w:rPr>
+              <w:t>u</w:t>
+            </w:r>
+          </w:p>
+        </w:tc>
+        <w:tc>
+          <w:tcPr>
+            <w:tcW w:type="dxa" w:w="1701"/>
+          </w:tcPr>
+          <w:p>
+            <w:r>
+              <w:rPr>
+                <w:rFonts w:ascii="Courier New" w:hAnsi="Courier New"/>
+                <w:sz w:val="18"/>
+              </w:rPr>
+              <w:t>lookup</w:t>
+            </w:r>
+          </w:p>
+        </w:tc>
+        <w:tc>
+          <w:tcPr>
+            <w:tcW w:type="dxa" w:w="2551"/>
+          </w:tcPr>
+          <w:p>
+            <w:r>
+              <w:rPr>
+                <w:rFonts w:ascii="Courier New" w:hAnsi="Courier New"/>
+                <w:sz w:val="18"/>
+              </w:rPr>
+              <w:t>&lt;callsign|prefix&gt;</w:t>
+            </w:r>
+          </w:p>
+        </w:tc>
+        <w:tc>
+          <w:tcPr>
+            <w:tcW w:type="dxa" w:w="3969"/>
+          </w:tcPr>
+          <w:p>
+            <w:r>
+              <w:rPr>
+                <w:rFonts w:ascii="Calibri" w:hAnsi="Calibri"/>
+                <w:sz w:val="20"/>
+              </w:rPr>
+              <w:t>Offline DXCC entity lookup</w:t>
+            </w:r>
+          </w:p>
+        </w:tc>
+      </w:tr>
+      <w:tr>
+        <w:tc>
+          <w:tcPr>
+            <w:tcW w:type="dxa" w:w="850"/>
+          </w:tcPr>
+          <w:p>
+            <w:r>
+              <w:rPr>
+                <w:rFonts w:ascii="Courier New" w:hAnsi="Courier New"/>
+                <w:sz w:val="18"/>
+              </w:rPr>
+              <w:t>k</w:t>
+            </w:r>
+          </w:p>
+        </w:tc>
+        <w:tc>
+          <w:tcPr>
+            <w:tcW w:type="dxa" w:w="1701"/>
+          </w:tcPr>
+          <w:p>
+            <w:r>
+              <w:rPr>
+                <w:rFonts w:ascii="Courier New" w:hAnsi="Courier New"/>
+                <w:sz w:val="18"/>
+              </w:rPr>
+              <w:t>callbook</w:t>
+            </w:r>
+          </w:p>
+        </w:tc>
+        <w:tc>
+          <w:tcPr>
+            <w:tcW w:type="dxa" w:w="2551"/>
+          </w:tcPr>
+          <w:p>
+            <w:r>
+              <w:rPr>
+                <w:rFonts w:ascii="Courier New" w:hAnsi="Courier New"/>
+                <w:sz w:val="18"/>
+              </w:rPr>
+              <w:t>&lt;callsign&gt;</w:t>
+            </w:r>
+          </w:p>
+        </w:tc>
+        <w:tc>
+          <w:tcPr>
+            <w:tcW w:type="dxa" w:w="3969"/>
+          </w:tcPr>
+          <w:p>
+            <w:r>
+              <w:rPr>
+                <w:rFonts w:ascii="Calibri" w:hAnsi="Calibri"/>
+                <w:sz w:val="20"/>
+              </w:rPr>
+              <w:t>Full callsign lookup (QRZ/HamQTH)</w:t>
+            </w:r>
+          </w:p>
+        </w:tc>
+      </w:tr>
+      <w:tr>
+        <w:tc>
+          <w:tcPr>
+            <w:tcW w:type="dxa" w:w="850"/>
+          </w:tcPr>
+          <w:p>
+            <w:r>
+              <w:rPr>
+                <w:rFonts w:ascii="Courier New" w:hAnsi="Courier New"/>
+                <w:sz w:val="18"/>
+              </w:rPr>
+              <w:t>v</w:t>
+            </w:r>
+          </w:p>
+        </w:tc>
+        <w:tc>
+          <w:tcPr>
+            <w:tcW w:type="dxa" w:w="1701"/>
+          </w:tcPr>
+          <w:p>
+            <w:r>
+              <w:rPr>
+                <w:rFonts w:ascii="Courier New" w:hAnsi="Courier New"/>
+                <w:sz w:val="18"/>
+              </w:rPr>
+              <w:t>save</w:t>
+            </w:r>
+          </w:p>
+        </w:tc>
+        <w:tc>
+          <w:tcPr>
+            <w:tcW w:type="dxa" w:w="2551"/>
+          </w:tcPr>
+          <w:p>
+            <w:r>
+              <w:rPr>
+                <w:rFonts w:ascii="Courier New" w:hAnsi="Courier New"/>
+                <w:sz w:val="18"/>
+              </w:rPr>
+            </w:r>
+          </w:p>
+        </w:tc>
+        <w:tc>
+          <w:tcPr>
+            <w:tcW w:type="dxa" w:w="3969"/>
+          </w:tcPr>
+          <w:p>
+            <w:r>
+              <w:rPr>
+                <w:rFonts w:ascii="Calibri" w:hAnsi="Calibri"/>
+                <w:sz w:val="20"/>
+              </w:rPr>
+              <w:t>Save settings to disk now</w:t>
+            </w:r>
+          </w:p>
+        </w:tc>
+      </w:tr>
+      <w:tr>
+        <w:tc>
+          <w:tcPr>
+            <w:tcW w:type="dxa" w:w="850"/>
+          </w:tcPr>
+          <w:p>
+            <w:r>
+              <w:rPr>
+                <w:rFonts w:ascii="Courier New" w:hAnsi="Courier New"/>
+                <w:sz w:val="18"/>
+              </w:rPr>
+              <w:t>g</w:t>
+            </w:r>
+          </w:p>
+        </w:tc>
+        <w:tc>
+          <w:tcPr>
+            <w:tcW w:type="dxa" w:w="1701"/>
+          </w:tcPr>
+          <w:p>
+            <w:r>
+              <w:rPr>
+                <w:rFonts w:ascii="Courier New" w:hAnsi="Courier New"/>
+                <w:sz w:val="18"/>
+              </w:rPr>
+              <w:t>config</w:t>
+            </w:r>
+          </w:p>
+        </w:tc>
+        <w:tc>
+          <w:tcPr>
+            <w:tcW w:type="dxa" w:w="2551"/>
+          </w:tcPr>
+          <w:p>
+            <w:r>
+              <w:rPr>
+                <w:rFonts w:ascii="Courier New" w:hAnsi="Courier New"/>
+                <w:sz w:val="18"/>
+              </w:rPr>
+            </w:r>
+          </w:p>
+        </w:tc>
+        <w:tc>
+          <w:tcPr>
+            <w:tcW w:type="dxa" w:w="3969"/>
+          </w:tcPr>
+          <w:p>
+            <w:r>
+              <w:rPr>
+                <w:rFonts w:ascii="Calibri" w:hAnsi="Calibri"/>
+                <w:sz w:val="20"/>
+              </w:rPr>
+              <w:t>Show configuration file path</w:t>
+            </w:r>
+          </w:p>
+        </w:tc>
+      </w:tr>
+      <w:tr>
+        <w:tc>
+          <w:tcPr>
+            <w:tcW w:type="dxa" w:w="850"/>
+          </w:tcPr>
+          <w:p>
+            <w:r>
+              <w:rPr>
+                <w:rFonts w:ascii="Courier New" w:hAnsi="Courier New"/>
+                <w:sz w:val="18"/>
+              </w:rPr>
+              <w:t>q</w:t>
+            </w:r>
+          </w:p>
+        </w:tc>
+        <w:tc>
+          <w:tcPr>
+            <w:tcW w:type="dxa" w:w="1701"/>
+          </w:tcPr>
+          <w:p>
+            <w:r>
+              <w:rPr>
+                <w:rFonts w:ascii="Courier New" w:hAnsi="Courier New"/>
+                <w:sz w:val="18"/>
+              </w:rPr>
+              <w:t>quit</w:t>
+            </w:r>
+          </w:p>
+        </w:tc>
+        <w:tc>
+          <w:tcPr>
+            <w:tcW w:type="dxa" w:w="2551"/>
+          </w:tcPr>
+          <w:p>
+            <w:r>
+              <w:rPr>
+                <w:rFonts w:ascii="Courier New" w:hAnsi="Courier New"/>
+                <w:sz w:val="18"/>
+              </w:rPr>
+            </w:r>
+          </w:p>
+        </w:tc>
+        <w:tc>
+          <w:tcPr>
+            <w:tcW w:type="dxa" w:w="3969"/>
+          </w:tcPr>
+          <w:p>
+            <w:r>
+              <w:rPr>
+                <w:rFonts w:ascii="Calibri" w:hAnsi="Calibri"/>
+                <w:sz w:val="20"/>
+              </w:rPr>
+              <w:t>Exit the application</w:t>
+            </w:r>
+          </w:p>
+        </w:tc>
+      </w:tr>
+    </w:tbl>
+    <w:p>
+      <w:pPr>
+        <w:spacing w:before="0" w:after="80"/>
+      </w:pPr>
+    </w:p>
+    <w:p>
+      <w:pPr>
+        <w:spacing w:before="0" w:after="80"/>
+      </w:pPr>
+      <w:r>
+        <w:rPr>
+          <w:rFonts w:ascii="Calibri" w:hAnsi="Calibri"/>
+          <w:sz w:val="22"/>
+        </w:rPr>
+        <w:t>All aliases also work with help — for example, help / shows search help.</w:t>
+      </w:r>
+    </w:p>
+    <w:p>
+      <w:pPr>
+        <w:spacing w:before="0" w:after="80"/>
+      </w:pPr>
+      <w:r>
+        <w:rPr>
+          <w:rFonts w:ascii="Calibri" w:hAnsi="Calibri"/>
+          <w:sz w:val="22"/>
+        </w:rPr>
+        <w:t>Examples using aliases:</w:t>
+      </w:r>
+    </w:p>
+    <w:p>
+      <w:pPr>
+        <w:shd w:val="clear" w:color="auto" w:fill="DDEEFF"/>
+        <w:spacing w:before="40" w:after="40"/>
+        <w:ind w:left="360"/>
+      </w:pPr>
+      <w:r>
+        <w:rPr>
+          <w:rFonts w:ascii="Courier New" w:hAnsi="Courier New"/>
+          <w:sz w:val="18"/>
+        </w:rPr>
+        <w:t>c dxsummit G0ABC       # connect to DX Summit as G0ABC</w:t>
+        <w:br/>
+        <w:t>s                      # start streaming</w:t>
+        <w:br/>
+        <w:t>f band 20m             # filter to 20m only</w:t>
+        <w:br/>
+        <w:t>/ prefix EA            # search for all Spain spots</w:t>
+        <w:br/>
+        <w:t>k VK3IO                # callbook lookup for VK3IO</w:t>
+        <w:br/>
+        <w:t>u GM3WOJ               # offline DXCC lookup</w:t>
+        <w:br/>
+        <w:t>f clear                # remove all filters</w:t>
+        <w:br/>
+        <w:t>v                      # save settings</w:t>
+        <w:br/>
+        <w:t>q                      # quit</w:t>
+      </w:r>
+    </w:p>
+    <w:p>
+      <w:pPr>
+        <w:pStyle w:val="Heading2"/>
+        <w:spacing w:before="160" w:after="80"/>
+      </w:pPr>
+      <w:r>
+        <w:t>13.1  Keyboard Shortcuts</w:t>
+      </w:r>
+    </w:p>
+    <w:p>
+      <w:pPr>
+        <w:spacing w:before="0" w:after="80"/>
+      </w:pPr>
+      <w:r>
+        <w:rPr>
+          <w:rFonts w:ascii="Calibri" w:hAnsi="Calibri"/>
+          <w:sz w:val="22"/>
+        </w:rPr>
+        <w:t>In addition to command aliases, the following keyboard shortcuts work anywhere in the input field:</w:t>
+      </w:r>
+    </w:p>
+    <w:tbl>
+      <w:tblPr>
+        <w:tblStyle w:val="TableGrid"/>
+        <w:tblW w:type="auto" w:w="0"/>
+        <w:tblLook w:firstColumn="1" w:firstRow="1" w:lastColumn="0" w:lastRow="0" w:noHBand="0" w:noVBand="1" w:val="04A0"/>
+      </w:tblPr>
+      <w:tblGrid>
+        <w:gridCol w:w="4703"/>
+        <w:gridCol w:w="4703"/>
+      </w:tblGrid>
+      <w:tr>
+        <w:tc>
+          <w:tcPr>
+            <w:tcW w:type="dxa" w:w="1701"/>
+          </w:tcPr>
+          <w:p>
+            <w:pPr>
+              <w:shd w:val="clear" w:color="auto" w:fill="BDD7EE"/>
+            </w:pPr>
+            <w:r>
+              <w:rPr>
+                <w:rFonts w:ascii="Calibri" w:hAnsi="Calibri"/>
+                <w:b/>
+                <w:sz w:val="20"/>
+              </w:rPr>
+              <w:t>Key</w:t>
+            </w:r>
+          </w:p>
+        </w:tc>
+        <w:tc>
+          <w:tcPr>
+            <w:tcW w:type="dxa" w:w="7370"/>
+          </w:tcPr>
+          <w:p>
+            <w:pPr>
+              <w:shd w:val="clear" w:color="auto" w:fill="BDD7EE"/>
+            </w:pPr>
+            <w:r>
+              <w:rPr>
+                <w:rFonts w:ascii="Calibri" w:hAnsi="Calibri"/>
+                <w:b/>
+                <w:sz w:val="20"/>
+              </w:rPr>
+              <w:t>Action</w:t>
+            </w:r>
+          </w:p>
+        </w:tc>
+      </w:tr>
+      <w:tr>
+        <w:tc>
+          <w:tcPr>
+            <w:tcW w:type="dxa" w:w="1701"/>
+          </w:tcPr>
+          <w:p>
+            <w:r>
+              <w:rPr>
+                <w:rFonts w:ascii="Courier New" w:hAnsi="Courier New"/>
+                <w:sz w:val="20"/>
+              </w:rPr>
+              <w:t>Tab</w:t>
+            </w:r>
+          </w:p>
+        </w:tc>
+        <w:tc>
+          <w:tcPr>
+            <w:tcW w:type="dxa" w:w="7370"/>
+          </w:tcPr>
+          <w:p>
+            <w:r>
+              <w:rPr>
+                <w:rFonts w:ascii="Calibri" w:hAnsi="Calibri"/>
+                <w:sz w:val="20"/>
+              </w:rPr>
+              <w:t>Auto-complete the current command or argument</w:t>
+            </w:r>
+          </w:p>
+        </w:tc>
+      </w:tr>
+      <w:tr>
+        <w:tc>
+          <w:tcPr>
+            <w:tcW w:type="dxa" w:w="1701"/>
+          </w:tcPr>
+          <w:p>
+            <w:r>
+              <w:rPr>
+                <w:rFonts w:ascii="Courier New" w:hAnsi="Courier New"/>
+                <w:sz w:val="20"/>
+              </w:rPr>
+              <w:t>↑ / ↓</w:t>
+            </w:r>
+          </w:p>
+        </w:tc>
+        <w:tc>
+          <w:tcPr>
+            <w:tcW w:type="dxa" w:w="7370"/>
+          </w:tcPr>
+          <w:p>
+            <w:r>
+              <w:rPr>
+                <w:rFonts w:ascii="Calibri" w:hAnsi="Calibri"/>
+                <w:sz w:val="20"/>
+              </w:rPr>
+              <w:t>Scroll through command history</w:t>
+            </w:r>
+          </w:p>
+        </w:tc>
+      </w:tr>
+      <w:tr>
+        <w:tc>
+          <w:tcPr>
+            <w:tcW w:type="dxa" w:w="1701"/>
+          </w:tcPr>
+          <w:p>
+            <w:r>
+              <w:rPr>
+                <w:rFonts w:ascii="Courier New" w:hAnsi="Courier New"/>
+                <w:sz w:val="20"/>
+              </w:rPr>
+              <w:t>Page Up</w:t>
+            </w:r>
+          </w:p>
+        </w:tc>
+        <w:tc>
+          <w:tcPr>
+            <w:tcW w:type="dxa" w:w="7370"/>
+          </w:tcPr>
+          <w:p>
+            <w:r>
+              <w:rPr>
+                <w:rFonts w:ascii="Calibri" w:hAnsi="Calibri"/>
+                <w:sz w:val="20"/>
+              </w:rPr>
+              <w:t>Scroll the output pane up one page</w:t>
+            </w:r>
+          </w:p>
+        </w:tc>
+      </w:tr>
+      <w:tr>
+        <w:tc>
+          <w:tcPr>
+            <w:tcW w:type="dxa" w:w="1701"/>
+          </w:tcPr>
+          <w:p>
+            <w:r>
+              <w:rPr>
+                <w:rFonts w:ascii="Courier New" w:hAnsi="Courier New"/>
+                <w:sz w:val="20"/>
+              </w:rPr>
+              <w:t>Page Down</w:t>
+            </w:r>
+          </w:p>
+        </w:tc>
+        <w:tc>
+          <w:tcPr>
+            <w:tcW w:type="dxa" w:w="7370"/>
+          </w:tcPr>
+          <w:p>
+            <w:r>
+              <w:rPr>
+                <w:rFonts w:ascii="Calibri" w:hAnsi="Calibri"/>
+                <w:sz w:val="20"/>
+              </w:rPr>
+              <w:t>Scroll the output pane down one page</w:t>
+            </w:r>
+          </w:p>
+        </w:tc>
+      </w:tr>
+      <w:tr>
+        <w:tc>
+          <w:tcPr>
+            <w:tcW w:type="dxa" w:w="1701"/>
+          </w:tcPr>
+          <w:p>
+            <w:r>
+              <w:rPr>
+                <w:rFonts w:ascii="Courier New" w:hAnsi="Courier New"/>
+                <w:sz w:val="20"/>
+              </w:rPr>
+              <w:t>Escape</w:t>
+            </w:r>
+          </w:p>
+        </w:tc>
+        <w:tc>
+          <w:tcPr>
+            <w:tcW w:type="dxa" w:w="7370"/>
+          </w:tcPr>
+          <w:p>
+            <w:r>
+              <w:rPr>
+                <w:rFonts w:ascii="Calibri" w:hAnsi="Calibri"/>
+                <w:sz w:val="20"/>
+              </w:rPr>
+              <w:t>Jump back to live bottom (cancel scroll)</w:t>
+            </w:r>
+          </w:p>
+        </w:tc>
+      </w:tr>
+      <w:tr>
+        <w:tc>
+          <w:tcPr>
+            <w:tcW w:type="dxa" w:w="1701"/>
+          </w:tcPr>
+          <w:p>
+            <w:r>
+              <w:rPr>
+                <w:rFonts w:ascii="Courier New" w:hAnsi="Courier New"/>
+                <w:sz w:val="20"/>
+              </w:rPr>
+              <w:t>Ctrl-D</w:t>
+            </w:r>
+          </w:p>
+        </w:tc>
+        <w:tc>
+          <w:tcPr>
+            <w:tcW w:type="dxa" w:w="7370"/>
+          </w:tcPr>
+          <w:p>
+            <w:r>
+              <w:rPr>
+                <w:rFonts w:ascii="Calibri" w:hAnsi="Calibri"/>
+                <w:sz w:val="20"/>
+              </w:rPr>
+              <w:t>Exit the application</w:t>
+            </w:r>
+          </w:p>
+        </w:tc>
+      </w:tr>
+      <w:tr>
+        <w:tc>
+          <w:tcPr>
+            <w:tcW w:type="dxa" w:w="1701"/>
+          </w:tcPr>
+          <w:p>
+            <w:r>
+              <w:rPr>
+                <w:rFonts w:ascii="Courier New" w:hAnsi="Courier New"/>
+                <w:sz w:val="20"/>
+              </w:rPr>
+              <w:t>Ctrl-C</w:t>
+            </w:r>
+          </w:p>
+        </w:tc>
+        <w:tc>
+          <w:tcPr>
+            <w:tcW w:type="dxa" w:w="7370"/>
+          </w:tcPr>
+          <w:p>
+            <w:r>
+              <w:rPr>
+                <w:rFonts w:ascii="Calibri" w:hAnsi="Calibri"/>
+                <w:sz w:val="20"/>
+              </w:rPr>
+              <w:t>Clear the current input line</w:t>
+            </w:r>
+          </w:p>
+        </w:tc>
+      </w:tr>
+    </w:tbl>
     <w:sectPr>
       <w:pgSz w:w="12240" w:h="15840"/>
       <w:pgMar w:top="1417" w:right="1417" w:bottom="1417" w:left="1417" w:header="720" w:footer="720" w:gutter="0"/>

</xml_diff>

<commit_message>
Add sub-command short forms for search, filter, callbook
search: f=freq  c=call  p=prefix  (e.g. / f 14074, / p VK)
filter: b=band  m=mode  z=zone  d=dx  s=show  c=clear
  zone: a=add  r=remove  o=open  x=close  s=show
  dx:   i=include  e=exclude
  (e.g. f b 20m, f d i VK ZL, f z a 14 15)
callbook: s=set  sh=show  (e.g. k s hamqth user pass, k sh)

Updated help text for all affected commands and user manual
Section 13 with sub-command reference tables and a worked example.

https://claude.ai/code/session_019fNDhhkDtvNfBzqoqBhGQm
</commit_message>
<xml_diff>
--- a/DXClusterSpots_User_Manual.docx
+++ b/DXClusterSpots_User_Manual.docx
@@ -12220,6 +12220,1288 @@
         </w:tc>
       </w:tr>
     </w:tbl>
+    <w:p>
+      <w:pPr>
+        <w:pStyle w:val="Heading2"/>
+        <w:spacing w:before="160" w:after="80"/>
+      </w:pPr>
+      <w:r>
+        <w:t>13.2  Sub-command Short Forms</w:t>
+      </w:r>
+    </w:p>
+    <w:p>
+      <w:pPr>
+        <w:spacing w:before="0" w:after="80"/>
+      </w:pPr>
+      <w:r>
+        <w:rPr>
+          <w:rFonts w:ascii="Calibri" w:hAnsi="Calibri"/>
+          <w:sz w:val="22"/>
+        </w:rPr>
+        <w:t>In addition to the one-letter command aliases, many commands accept abbreviated sub-command tokens. These can be combined freely with the command alias to make common operations very fast.</w:t>
+      </w:r>
+    </w:p>
+    <w:p>
+      <w:pPr>
+        <w:pStyle w:val="Heading3"/>
+        <w:spacing w:before="160" w:after="80"/>
+      </w:pPr>
+      <w:r>
+        <w:t>search  /  (sub-commands: f c p)</w:t>
+      </w:r>
+    </w:p>
+    <w:tbl>
+      <w:tblPr>
+        <w:tblStyle w:val="TableGrid"/>
+        <w:tblW w:type="auto" w:w="0"/>
+        <w:tblLook w:firstColumn="1" w:firstRow="1" w:lastColumn="0" w:lastRow="0" w:noHBand="0" w:noVBand="1" w:val="04A0"/>
+      </w:tblPr>
+      <w:tblGrid>
+        <w:gridCol w:w="2351"/>
+        <w:gridCol w:w="2351"/>
+        <w:gridCol w:w="2351"/>
+        <w:gridCol w:w="2351"/>
+      </w:tblGrid>
+      <w:tr>
+        <w:tc>
+          <w:tcPr>
+            <w:tcW w:type="dxa" w:w="680"/>
+          </w:tcPr>
+          <w:p>
+            <w:pPr>
+              <w:shd w:val="clear" w:color="auto" w:fill="BDD7EE"/>
+            </w:pPr>
+            <w:r>
+              <w:rPr>
+                <w:rFonts w:ascii="Calibri" w:hAnsi="Calibri"/>
+                <w:b/>
+                <w:sz w:val="20"/>
+              </w:rPr>
+              <w:t>Short</w:t>
+            </w:r>
+          </w:p>
+        </w:tc>
+        <w:tc>
+          <w:tcPr>
+            <w:tcW w:type="dxa" w:w="1020"/>
+          </w:tcPr>
+          <w:p>
+            <w:pPr>
+              <w:shd w:val="clear" w:color="auto" w:fill="BDD7EE"/>
+            </w:pPr>
+            <w:r>
+              <w:rPr>
+                <w:rFonts w:ascii="Calibri" w:hAnsi="Calibri"/>
+                <w:b/>
+                <w:sz w:val="20"/>
+              </w:rPr>
+              <w:t>Full</w:t>
+            </w:r>
+          </w:p>
+        </w:tc>
+        <w:tc>
+          <w:tcPr>
+            <w:tcW w:type="dxa" w:w="2835"/>
+          </w:tcPr>
+          <w:p>
+            <w:pPr>
+              <w:shd w:val="clear" w:color="auto" w:fill="BDD7EE"/>
+            </w:pPr>
+            <w:r>
+              <w:rPr>
+                <w:rFonts w:ascii="Calibri" w:hAnsi="Calibri"/>
+                <w:b/>
+                <w:sz w:val="20"/>
+              </w:rPr>
+              <w:t>Example</w:t>
+            </w:r>
+          </w:p>
+        </w:tc>
+        <w:tc>
+          <w:tcPr>
+            <w:tcW w:type="dxa" w:w="4535"/>
+          </w:tcPr>
+          <w:p>
+            <w:pPr>
+              <w:shd w:val="clear" w:color="auto" w:fill="BDD7EE"/>
+            </w:pPr>
+            <w:r>
+              <w:rPr>
+                <w:rFonts w:ascii="Calibri" w:hAnsi="Calibri"/>
+                <w:b/>
+                <w:sz w:val="20"/>
+              </w:rPr>
+              <w:t>Effect</w:t>
+            </w:r>
+          </w:p>
+        </w:tc>
+      </w:tr>
+      <w:tr>
+        <w:tc>
+          <w:tcPr>
+            <w:tcW w:type="dxa" w:w="680"/>
+          </w:tcPr>
+          <w:p>
+            <w:r>
+              <w:rPr>
+                <w:rFonts w:ascii="Courier New" w:hAnsi="Courier New"/>
+                <w:sz w:val="18"/>
+              </w:rPr>
+              <w:t>f</w:t>
+            </w:r>
+          </w:p>
+        </w:tc>
+        <w:tc>
+          <w:tcPr>
+            <w:tcW w:type="dxa" w:w="1020"/>
+          </w:tcPr>
+          <w:p>
+            <w:r>
+              <w:rPr>
+                <w:rFonts w:ascii="Courier New" w:hAnsi="Courier New"/>
+                <w:sz w:val="18"/>
+              </w:rPr>
+              <w:t>freq</w:t>
+            </w:r>
+          </w:p>
+        </w:tc>
+        <w:tc>
+          <w:tcPr>
+            <w:tcW w:type="dxa" w:w="2835"/>
+          </w:tcPr>
+          <w:p>
+            <w:r>
+              <w:rPr>
+                <w:rFonts w:ascii="Courier New" w:hAnsi="Courier New"/>
+                <w:sz w:val="18"/>
+              </w:rPr>
+              <w:t>/ f 14074</w:t>
+            </w:r>
+          </w:p>
+        </w:tc>
+        <w:tc>
+          <w:tcPr>
+            <w:tcW w:type="dxa" w:w="4535"/>
+          </w:tcPr>
+          <w:p>
+            <w:r>
+              <w:rPr>
+                <w:rFonts w:ascii="Calibri" w:hAnsi="Calibri"/>
+                <w:sz w:val="20"/>
+              </w:rPr>
+              <w:t>Spots within ±5 kHz of 14074 kHz</w:t>
+            </w:r>
+          </w:p>
+        </w:tc>
+      </w:tr>
+      <w:tr>
+        <w:tc>
+          <w:tcPr>
+            <w:tcW w:type="dxa" w:w="680"/>
+          </w:tcPr>
+          <w:p>
+            <w:r>
+              <w:rPr>
+                <w:rFonts w:ascii="Courier New" w:hAnsi="Courier New"/>
+                <w:sz w:val="18"/>
+              </w:rPr>
+              <w:t>c</w:t>
+            </w:r>
+          </w:p>
+        </w:tc>
+        <w:tc>
+          <w:tcPr>
+            <w:tcW w:type="dxa" w:w="1020"/>
+          </w:tcPr>
+          <w:p>
+            <w:r>
+              <w:rPr>
+                <w:rFonts w:ascii="Courier New" w:hAnsi="Courier New"/>
+                <w:sz w:val="18"/>
+              </w:rPr>
+              <w:t>call</w:t>
+            </w:r>
+          </w:p>
+        </w:tc>
+        <w:tc>
+          <w:tcPr>
+            <w:tcW w:type="dxa" w:w="2835"/>
+          </w:tcPr>
+          <w:p>
+            <w:r>
+              <w:rPr>
+                <w:rFonts w:ascii="Courier New" w:hAnsi="Courier New"/>
+                <w:sz w:val="18"/>
+              </w:rPr>
+              <w:t>/ c G3SXW</w:t>
+            </w:r>
+          </w:p>
+        </w:tc>
+        <w:tc>
+          <w:tcPr>
+            <w:tcW w:type="dxa" w:w="4535"/>
+          </w:tcPr>
+          <w:p>
+            <w:r>
+              <w:rPr>
+                <w:rFonts w:ascii="Calibri" w:hAnsi="Calibri"/>
+                <w:sz w:val="20"/>
+              </w:rPr>
+              <w:t>Spots where DX callsign matches G3SXW</w:t>
+            </w:r>
+          </w:p>
+        </w:tc>
+      </w:tr>
+      <w:tr>
+        <w:tc>
+          <w:tcPr>
+            <w:tcW w:type="dxa" w:w="680"/>
+          </w:tcPr>
+          <w:p>
+            <w:r>
+              <w:rPr>
+                <w:rFonts w:ascii="Courier New" w:hAnsi="Courier New"/>
+                <w:sz w:val="18"/>
+              </w:rPr>
+              <w:t>p</w:t>
+            </w:r>
+          </w:p>
+        </w:tc>
+        <w:tc>
+          <w:tcPr>
+            <w:tcW w:type="dxa" w:w="1020"/>
+          </w:tcPr>
+          <w:p>
+            <w:r>
+              <w:rPr>
+                <w:rFonts w:ascii="Courier New" w:hAnsi="Courier New"/>
+                <w:sz w:val="18"/>
+              </w:rPr>
+              <w:t>prefix</w:t>
+            </w:r>
+          </w:p>
+        </w:tc>
+        <w:tc>
+          <w:tcPr>
+            <w:tcW w:type="dxa" w:w="2835"/>
+          </w:tcPr>
+          <w:p>
+            <w:r>
+              <w:rPr>
+                <w:rFonts w:ascii="Courier New" w:hAnsi="Courier New"/>
+                <w:sz w:val="18"/>
+              </w:rPr>
+              <w:t>/ p VK</w:t>
+            </w:r>
+          </w:p>
+        </w:tc>
+        <w:tc>
+          <w:tcPr>
+            <w:tcW w:type="dxa" w:w="4535"/>
+          </w:tcPr>
+          <w:p>
+            <w:r>
+              <w:rPr>
+                <w:rFonts w:ascii="Calibri" w:hAnsi="Calibri"/>
+                <w:sz w:val="20"/>
+              </w:rPr>
+              <w:t>All spots from the same DXCC entity as VK</w:t>
+            </w:r>
+          </w:p>
+        </w:tc>
+      </w:tr>
+    </w:tbl>
+    <w:p>
+      <w:pPr>
+        <w:spacing w:before="0" w:after="80"/>
+      </w:pPr>
+    </w:p>
+    <w:p>
+      <w:pPr>
+        <w:pStyle w:val="Heading3"/>
+        <w:spacing w:before="160" w:after="80"/>
+      </w:pPr>
+      <w:r>
+        <w:t>filter  f  (sub-commands: b m z d s c  and deeper)</w:t>
+      </w:r>
+    </w:p>
+    <w:p>
+      <w:pPr>
+        <w:spacing w:before="0" w:after="80"/>
+      </w:pPr>
+      <w:r>
+        <w:rPr>
+          <w:rFonts w:ascii="Calibri" w:hAnsi="Calibri"/>
+          <w:sz w:val="22"/>
+        </w:rPr>
+        <w:t>The filter command has a full hierarchy of short forms:</w:t>
+      </w:r>
+    </w:p>
+    <w:p>
+      <w:pPr>
+        <w:shd w:val="clear" w:color="auto" w:fill="DDEEFF"/>
+        <w:spacing w:before="40" w:after="40"/>
+        <w:ind w:left="360"/>
+      </w:pPr>
+      <w:r>
+        <w:rPr>
+          <w:rFonts w:ascii="Courier New" w:hAnsi="Courier New"/>
+          <w:sz w:val="18"/>
+        </w:rPr>
+        <w:t>f b 20m 40m         →  filter band 20m 40m</w:t>
+        <w:br/>
+        <w:t>f m FT8 CW          →  filter mode FT8 CW</w:t>
+        <w:br/>
+        <w:t>f d i VK ZL         →  filter dx include VK ZL     (d=dx, i=include)</w:t>
+        <w:br/>
+        <w:t>f d e G ON DL       →  filter dx exclude G ON DL   (d=dx, e=exclude)</w:t>
+        <w:br/>
+        <w:t>f z a 14 15         →  filter zone add 14 15       (z=zone, a=add)</w:t>
+        <w:br/>
+        <w:t>f z r 14            →  filter zone remove 14       (z=zone, r=remove)</w:t>
+        <w:br/>
+        <w:t>f z o               →  filter zone open            (z=zone, o=open)</w:t>
+        <w:br/>
+        <w:t>f z x               →  filter zone close           (z=zone, x=close)</w:t>
+        <w:br/>
+        <w:t>f z s               →  filter zone show            (z=zone, s=show)</w:t>
+        <w:br/>
+        <w:t>f s                 →  filter show</w:t>
+        <w:br/>
+        <w:t>f c                 →  filter clear</w:t>
+      </w:r>
+    </w:p>
+    <w:tbl>
+      <w:tblPr>
+        <w:tblStyle w:val="TableGrid"/>
+        <w:tblW w:type="auto" w:w="0"/>
+        <w:tblLook w:firstColumn="1" w:firstRow="1" w:lastColumn="0" w:lastRow="0" w:noHBand="0" w:noVBand="1" w:val="04A0"/>
+      </w:tblPr>
+      <w:tblGrid>
+        <w:gridCol w:w="3135"/>
+        <w:gridCol w:w="3135"/>
+        <w:gridCol w:w="3135"/>
+      </w:tblGrid>
+      <w:tr>
+        <w:tc>
+          <w:tcPr>
+            <w:tcW w:type="dxa" w:w="850"/>
+          </w:tcPr>
+          <w:p>
+            <w:pPr>
+              <w:shd w:val="clear" w:color="auto" w:fill="BDD7EE"/>
+            </w:pPr>
+            <w:r>
+              <w:rPr>
+                <w:rFonts w:ascii="Calibri" w:hAnsi="Calibri"/>
+                <w:b/>
+                <w:sz w:val="20"/>
+              </w:rPr>
+              <w:t>Short</w:t>
+            </w:r>
+          </w:p>
+        </w:tc>
+        <w:tc>
+          <w:tcPr>
+            <w:tcW w:type="dxa" w:w="1417"/>
+          </w:tcPr>
+          <w:p>
+            <w:pPr>
+              <w:shd w:val="clear" w:color="auto" w:fill="BDD7EE"/>
+            </w:pPr>
+            <w:r>
+              <w:rPr>
+                <w:rFonts w:ascii="Calibri" w:hAnsi="Calibri"/>
+                <w:b/>
+                <w:sz w:val="20"/>
+              </w:rPr>
+              <w:t>Full</w:t>
+            </w:r>
+          </w:p>
+        </w:tc>
+        <w:tc>
+          <w:tcPr>
+            <w:tcW w:type="dxa" w:w="6803"/>
+          </w:tcPr>
+          <w:p>
+            <w:pPr>
+              <w:shd w:val="clear" w:color="auto" w:fill="BDD7EE"/>
+            </w:pPr>
+            <w:r>
+              <w:rPr>
+                <w:rFonts w:ascii="Calibri" w:hAnsi="Calibri"/>
+                <w:b/>
+                <w:sz w:val="20"/>
+              </w:rPr>
+              <w:t>Description</w:t>
+            </w:r>
+          </w:p>
+        </w:tc>
+      </w:tr>
+      <w:tr>
+        <w:tc>
+          <w:tcPr>
+            <w:tcW w:type="dxa" w:w="850"/>
+          </w:tcPr>
+          <w:p>
+            <w:r>
+              <w:rPr>
+                <w:rFonts w:ascii="Courier New" w:hAnsi="Courier New"/>
+                <w:sz w:val="18"/>
+              </w:rPr>
+              <w:t>b</w:t>
+            </w:r>
+          </w:p>
+        </w:tc>
+        <w:tc>
+          <w:tcPr>
+            <w:tcW w:type="dxa" w:w="1417"/>
+          </w:tcPr>
+          <w:p>
+            <w:r>
+              <w:rPr>
+                <w:rFonts w:ascii="Courier New" w:hAnsi="Courier New"/>
+                <w:sz w:val="18"/>
+              </w:rPr>
+              <w:t>band</w:t>
+            </w:r>
+          </w:p>
+        </w:tc>
+        <w:tc>
+          <w:tcPr>
+            <w:tcW w:type="dxa" w:w="6803"/>
+          </w:tcPr>
+          <w:p>
+            <w:r>
+              <w:rPr>
+                <w:rFonts w:ascii="Calibri" w:hAnsi="Calibri"/>
+                <w:sz w:val="20"/>
+              </w:rPr>
+              <w:t>Filter by band</w:t>
+            </w:r>
+          </w:p>
+        </w:tc>
+      </w:tr>
+      <w:tr>
+        <w:tc>
+          <w:tcPr>
+            <w:tcW w:type="dxa" w:w="850"/>
+          </w:tcPr>
+          <w:p>
+            <w:r>
+              <w:rPr>
+                <w:rFonts w:ascii="Courier New" w:hAnsi="Courier New"/>
+                <w:sz w:val="18"/>
+              </w:rPr>
+              <w:t>m</w:t>
+            </w:r>
+          </w:p>
+        </w:tc>
+        <w:tc>
+          <w:tcPr>
+            <w:tcW w:type="dxa" w:w="1417"/>
+          </w:tcPr>
+          <w:p>
+            <w:r>
+              <w:rPr>
+                <w:rFonts w:ascii="Courier New" w:hAnsi="Courier New"/>
+                <w:sz w:val="18"/>
+              </w:rPr>
+              <w:t>mode</w:t>
+            </w:r>
+          </w:p>
+        </w:tc>
+        <w:tc>
+          <w:tcPr>
+            <w:tcW w:type="dxa" w:w="6803"/>
+          </w:tcPr>
+          <w:p>
+            <w:r>
+              <w:rPr>
+                <w:rFonts w:ascii="Calibri" w:hAnsi="Calibri"/>
+                <w:sz w:val="20"/>
+              </w:rPr>
+              <w:t>Filter by mode</w:t>
+            </w:r>
+          </w:p>
+        </w:tc>
+      </w:tr>
+      <w:tr>
+        <w:tc>
+          <w:tcPr>
+            <w:tcW w:type="dxa" w:w="850"/>
+          </w:tcPr>
+          <w:p>
+            <w:r>
+              <w:rPr>
+                <w:rFonts w:ascii="Courier New" w:hAnsi="Courier New"/>
+                <w:sz w:val="18"/>
+              </w:rPr>
+              <w:t>z</w:t>
+            </w:r>
+          </w:p>
+        </w:tc>
+        <w:tc>
+          <w:tcPr>
+            <w:tcW w:type="dxa" w:w="1417"/>
+          </w:tcPr>
+          <w:p>
+            <w:r>
+              <w:rPr>
+                <w:rFonts w:ascii="Courier New" w:hAnsi="Courier New"/>
+                <w:sz w:val="18"/>
+              </w:rPr>
+              <w:t>zone</w:t>
+            </w:r>
+          </w:p>
+        </w:tc>
+        <w:tc>
+          <w:tcPr>
+            <w:tcW w:type="dxa" w:w="6803"/>
+          </w:tcPr>
+          <w:p>
+            <w:r>
+              <w:rPr>
+                <w:rFonts w:ascii="Calibri" w:hAnsi="Calibri"/>
+                <w:sz w:val="20"/>
+              </w:rPr>
+              <w:t>Filter by DX station CQ zone</w:t>
+            </w:r>
+          </w:p>
+        </w:tc>
+      </w:tr>
+      <w:tr>
+        <w:tc>
+          <w:tcPr>
+            <w:tcW w:type="dxa" w:w="850"/>
+          </w:tcPr>
+          <w:p>
+            <w:r>
+              <w:rPr>
+                <w:rFonts w:ascii="Courier New" w:hAnsi="Courier New"/>
+                <w:sz w:val="18"/>
+              </w:rPr>
+              <w:t>d</w:t>
+            </w:r>
+          </w:p>
+        </w:tc>
+        <w:tc>
+          <w:tcPr>
+            <w:tcW w:type="dxa" w:w="1417"/>
+          </w:tcPr>
+          <w:p>
+            <w:r>
+              <w:rPr>
+                <w:rFonts w:ascii="Courier New" w:hAnsi="Courier New"/>
+                <w:sz w:val="18"/>
+              </w:rPr>
+              <w:t>dx</w:t>
+            </w:r>
+          </w:p>
+        </w:tc>
+        <w:tc>
+          <w:tcPr>
+            <w:tcW w:type="dxa" w:w="6803"/>
+          </w:tcPr>
+          <w:p>
+            <w:r>
+              <w:rPr>
+                <w:rFonts w:ascii="Calibri" w:hAnsi="Calibri"/>
+                <w:sz w:val="20"/>
+              </w:rPr>
+              <w:t>DX callsign include / exclude</w:t>
+            </w:r>
+          </w:p>
+        </w:tc>
+      </w:tr>
+      <w:tr>
+        <w:tc>
+          <w:tcPr>
+            <w:tcW w:type="dxa" w:w="850"/>
+          </w:tcPr>
+          <w:p>
+            <w:r>
+              <w:rPr>
+                <w:rFonts w:ascii="Courier New" w:hAnsi="Courier New"/>
+                <w:sz w:val="18"/>
+              </w:rPr>
+              <w:t>s</w:t>
+            </w:r>
+          </w:p>
+        </w:tc>
+        <w:tc>
+          <w:tcPr>
+            <w:tcW w:type="dxa" w:w="1417"/>
+          </w:tcPr>
+          <w:p>
+            <w:r>
+              <w:rPr>
+                <w:rFonts w:ascii="Courier New" w:hAnsi="Courier New"/>
+                <w:sz w:val="18"/>
+              </w:rPr>
+              <w:t>show</w:t>
+            </w:r>
+          </w:p>
+        </w:tc>
+        <w:tc>
+          <w:tcPr>
+            <w:tcW w:type="dxa" w:w="6803"/>
+          </w:tcPr>
+          <w:p>
+            <w:r>
+              <w:rPr>
+                <w:rFonts w:ascii="Calibri" w:hAnsi="Calibri"/>
+                <w:sz w:val="20"/>
+              </w:rPr>
+              <w:t>Show all active filters</w:t>
+            </w:r>
+          </w:p>
+        </w:tc>
+      </w:tr>
+      <w:tr>
+        <w:tc>
+          <w:tcPr>
+            <w:tcW w:type="dxa" w:w="850"/>
+          </w:tcPr>
+          <w:p>
+            <w:r>
+              <w:rPr>
+                <w:rFonts w:ascii="Courier New" w:hAnsi="Courier New"/>
+                <w:sz w:val="18"/>
+              </w:rPr>
+              <w:t>c</w:t>
+            </w:r>
+          </w:p>
+        </w:tc>
+        <w:tc>
+          <w:tcPr>
+            <w:tcW w:type="dxa" w:w="1417"/>
+          </w:tcPr>
+          <w:p>
+            <w:r>
+              <w:rPr>
+                <w:rFonts w:ascii="Courier New" w:hAnsi="Courier New"/>
+                <w:sz w:val="18"/>
+              </w:rPr>
+              <w:t>clear</w:t>
+            </w:r>
+          </w:p>
+        </w:tc>
+        <w:tc>
+          <w:tcPr>
+            <w:tcW w:type="dxa" w:w="6803"/>
+          </w:tcPr>
+          <w:p>
+            <w:r>
+              <w:rPr>
+                <w:rFonts w:ascii="Calibri" w:hAnsi="Calibri"/>
+                <w:sz w:val="20"/>
+              </w:rPr>
+              <w:t>Remove all filters</w:t>
+            </w:r>
+          </w:p>
+        </w:tc>
+      </w:tr>
+      <w:tr>
+        <w:tc>
+          <w:tcPr>
+            <w:tcW w:type="dxa" w:w="850"/>
+          </w:tcPr>
+          <w:p>
+            <w:r>
+              <w:rPr>
+                <w:rFonts w:ascii="Courier New" w:hAnsi="Courier New"/>
+                <w:sz w:val="18"/>
+              </w:rPr>
+              <w:t>a</w:t>
+            </w:r>
+          </w:p>
+        </w:tc>
+        <w:tc>
+          <w:tcPr>
+            <w:tcW w:type="dxa" w:w="1417"/>
+          </w:tcPr>
+          <w:p>
+            <w:r>
+              <w:rPr>
+                <w:rFonts w:ascii="Courier New" w:hAnsi="Courier New"/>
+                <w:sz w:val="18"/>
+              </w:rPr>
+              <w:t>add</w:t>
+            </w:r>
+          </w:p>
+        </w:tc>
+        <w:tc>
+          <w:tcPr>
+            <w:tcW w:type="dxa" w:w="6803"/>
+          </w:tcPr>
+          <w:p>
+            <w:r>
+              <w:rPr>
+                <w:rFonts w:ascii="Calibri" w:hAnsi="Calibri"/>
+                <w:sz w:val="20"/>
+              </w:rPr>
+              <w:t>(zone sub) Add zone(s) to allow list</w:t>
+            </w:r>
+          </w:p>
+        </w:tc>
+      </w:tr>
+      <w:tr>
+        <w:tc>
+          <w:tcPr>
+            <w:tcW w:type="dxa" w:w="850"/>
+          </w:tcPr>
+          <w:p>
+            <w:r>
+              <w:rPr>
+                <w:rFonts w:ascii="Courier New" w:hAnsi="Courier New"/>
+                <w:sz w:val="18"/>
+              </w:rPr>
+              <w:t>r</w:t>
+            </w:r>
+          </w:p>
+        </w:tc>
+        <w:tc>
+          <w:tcPr>
+            <w:tcW w:type="dxa" w:w="1417"/>
+          </w:tcPr>
+          <w:p>
+            <w:r>
+              <w:rPr>
+                <w:rFonts w:ascii="Courier New" w:hAnsi="Courier New"/>
+                <w:sz w:val="18"/>
+              </w:rPr>
+              <w:t>remove</w:t>
+            </w:r>
+          </w:p>
+        </w:tc>
+        <w:tc>
+          <w:tcPr>
+            <w:tcW w:type="dxa" w:w="6803"/>
+          </w:tcPr>
+          <w:p>
+            <w:r>
+              <w:rPr>
+                <w:rFonts w:ascii="Calibri" w:hAnsi="Calibri"/>
+                <w:sz w:val="20"/>
+              </w:rPr>
+              <w:t>(zone sub) Remove zone(s) from allow list</w:t>
+            </w:r>
+          </w:p>
+        </w:tc>
+      </w:tr>
+      <w:tr>
+        <w:tc>
+          <w:tcPr>
+            <w:tcW w:type="dxa" w:w="850"/>
+          </w:tcPr>
+          <w:p>
+            <w:r>
+              <w:rPr>
+                <w:rFonts w:ascii="Courier New" w:hAnsi="Courier New"/>
+                <w:sz w:val="18"/>
+              </w:rPr>
+              <w:t>o</w:t>
+            </w:r>
+          </w:p>
+        </w:tc>
+        <w:tc>
+          <w:tcPr>
+            <w:tcW w:type="dxa" w:w="1417"/>
+          </w:tcPr>
+          <w:p>
+            <w:r>
+              <w:rPr>
+                <w:rFonts w:ascii="Courier New" w:hAnsi="Courier New"/>
+                <w:sz w:val="18"/>
+              </w:rPr>
+              <w:t>open</w:t>
+            </w:r>
+          </w:p>
+        </w:tc>
+        <w:tc>
+          <w:tcPr>
+            <w:tcW w:type="dxa" w:w="6803"/>
+          </w:tcPr>
+          <w:p>
+            <w:r>
+              <w:rPr>
+                <w:rFonts w:ascii="Calibri" w:hAnsi="Calibri"/>
+                <w:sz w:val="20"/>
+              </w:rPr>
+              <w:t>(zone sub) Accept all zones</w:t>
+            </w:r>
+          </w:p>
+        </w:tc>
+      </w:tr>
+      <w:tr>
+        <w:tc>
+          <w:tcPr>
+            <w:tcW w:type="dxa" w:w="850"/>
+          </w:tcPr>
+          <w:p>
+            <w:r>
+              <w:rPr>
+                <w:rFonts w:ascii="Courier New" w:hAnsi="Courier New"/>
+                <w:sz w:val="18"/>
+              </w:rPr>
+              <w:t>x</w:t>
+            </w:r>
+          </w:p>
+        </w:tc>
+        <w:tc>
+          <w:tcPr>
+            <w:tcW w:type="dxa" w:w="1417"/>
+          </w:tcPr>
+          <w:p>
+            <w:r>
+              <w:rPr>
+                <w:rFonts w:ascii="Courier New" w:hAnsi="Courier New"/>
+                <w:sz w:val="18"/>
+              </w:rPr>
+              <w:t>close</w:t>
+            </w:r>
+          </w:p>
+        </w:tc>
+        <w:tc>
+          <w:tcPr>
+            <w:tcW w:type="dxa" w:w="6803"/>
+          </w:tcPr>
+          <w:p>
+            <w:r>
+              <w:rPr>
+                <w:rFonts w:ascii="Calibri" w:hAnsi="Calibri"/>
+                <w:sz w:val="20"/>
+              </w:rPr>
+              <w:t>(zone sub) Reject all zones</w:t>
+            </w:r>
+          </w:p>
+        </w:tc>
+      </w:tr>
+      <w:tr>
+        <w:tc>
+          <w:tcPr>
+            <w:tcW w:type="dxa" w:w="850"/>
+          </w:tcPr>
+          <w:p>
+            <w:r>
+              <w:rPr>
+                <w:rFonts w:ascii="Courier New" w:hAnsi="Courier New"/>
+                <w:sz w:val="18"/>
+              </w:rPr>
+              <w:t>i</w:t>
+            </w:r>
+          </w:p>
+        </w:tc>
+        <w:tc>
+          <w:tcPr>
+            <w:tcW w:type="dxa" w:w="1417"/>
+          </w:tcPr>
+          <w:p>
+            <w:r>
+              <w:rPr>
+                <w:rFonts w:ascii="Courier New" w:hAnsi="Courier New"/>
+                <w:sz w:val="18"/>
+              </w:rPr>
+              <w:t>include</w:t>
+            </w:r>
+          </w:p>
+        </w:tc>
+        <w:tc>
+          <w:tcPr>
+            <w:tcW w:type="dxa" w:w="6803"/>
+          </w:tcPr>
+          <w:p>
+            <w:r>
+              <w:rPr>
+                <w:rFonts w:ascii="Calibri" w:hAnsi="Calibri"/>
+                <w:sz w:val="20"/>
+              </w:rPr>
+              <w:t>(dx sub)   Include these prefixes only</w:t>
+            </w:r>
+          </w:p>
+        </w:tc>
+      </w:tr>
+      <w:tr>
+        <w:tc>
+          <w:tcPr>
+            <w:tcW w:type="dxa" w:w="850"/>
+          </w:tcPr>
+          <w:p>
+            <w:r>
+              <w:rPr>
+                <w:rFonts w:ascii="Courier New" w:hAnsi="Courier New"/>
+                <w:sz w:val="18"/>
+              </w:rPr>
+              <w:t>e</w:t>
+            </w:r>
+          </w:p>
+        </w:tc>
+        <w:tc>
+          <w:tcPr>
+            <w:tcW w:type="dxa" w:w="1417"/>
+          </w:tcPr>
+          <w:p>
+            <w:r>
+              <w:rPr>
+                <w:rFonts w:ascii="Courier New" w:hAnsi="Courier New"/>
+                <w:sz w:val="18"/>
+              </w:rPr>
+              <w:t>exclude</w:t>
+            </w:r>
+          </w:p>
+        </w:tc>
+        <w:tc>
+          <w:tcPr>
+            <w:tcW w:type="dxa" w:w="6803"/>
+          </w:tcPr>
+          <w:p>
+            <w:r>
+              <w:rPr>
+                <w:rFonts w:ascii="Calibri" w:hAnsi="Calibri"/>
+                <w:sz w:val="20"/>
+              </w:rPr>
+              <w:t>(dx sub)   Exclude these prefixes</w:t>
+            </w:r>
+          </w:p>
+        </w:tc>
+      </w:tr>
+    </w:tbl>
+    <w:p>
+      <w:pPr>
+        <w:spacing w:before="0" w:after="80"/>
+      </w:pPr>
+    </w:p>
+    <w:p>
+      <w:pPr>
+        <w:pStyle w:val="Heading3"/>
+        <w:spacing w:before="160" w:after="80"/>
+      </w:pPr>
+      <w:r>
+        <w:t>callbook  k  (sub-commands: s  sh)</w:t>
+      </w:r>
+    </w:p>
+    <w:tbl>
+      <w:tblPr>
+        <w:tblStyle w:val="TableGrid"/>
+        <w:tblW w:type="auto" w:w="0"/>
+        <w:tblLook w:firstColumn="1" w:firstRow="1" w:lastColumn="0" w:lastRow="0" w:noHBand="0" w:noVBand="1" w:val="04A0"/>
+      </w:tblPr>
+      <w:tblGrid>
+        <w:gridCol w:w="2351"/>
+        <w:gridCol w:w="2351"/>
+        <w:gridCol w:w="2351"/>
+        <w:gridCol w:w="2351"/>
+      </w:tblGrid>
+      <w:tr>
+        <w:tc>
+          <w:tcPr>
+            <w:tcW w:type="dxa" w:w="680"/>
+          </w:tcPr>
+          <w:p>
+            <w:pPr>
+              <w:shd w:val="clear" w:color="auto" w:fill="BDD7EE"/>
+            </w:pPr>
+            <w:r>
+              <w:rPr>
+                <w:rFonts w:ascii="Calibri" w:hAnsi="Calibri"/>
+                <w:b/>
+                <w:sz w:val="20"/>
+              </w:rPr>
+              <w:t>Short</w:t>
+            </w:r>
+          </w:p>
+        </w:tc>
+        <w:tc>
+          <w:tcPr>
+            <w:tcW w:type="dxa" w:w="1020"/>
+          </w:tcPr>
+          <w:p>
+            <w:pPr>
+              <w:shd w:val="clear" w:color="auto" w:fill="BDD7EE"/>
+            </w:pPr>
+            <w:r>
+              <w:rPr>
+                <w:rFonts w:ascii="Calibri" w:hAnsi="Calibri"/>
+                <w:b/>
+                <w:sz w:val="20"/>
+              </w:rPr>
+              <w:t>Full</w:t>
+            </w:r>
+          </w:p>
+        </w:tc>
+        <w:tc>
+          <w:tcPr>
+            <w:tcW w:type="dxa" w:w="2835"/>
+          </w:tcPr>
+          <w:p>
+            <w:pPr>
+              <w:shd w:val="clear" w:color="auto" w:fill="BDD7EE"/>
+            </w:pPr>
+            <w:r>
+              <w:rPr>
+                <w:rFonts w:ascii="Calibri" w:hAnsi="Calibri"/>
+                <w:b/>
+                <w:sz w:val="20"/>
+              </w:rPr>
+              <w:t>Example</w:t>
+            </w:r>
+          </w:p>
+        </w:tc>
+        <w:tc>
+          <w:tcPr>
+            <w:tcW w:type="dxa" w:w="4535"/>
+          </w:tcPr>
+          <w:p>
+            <w:pPr>
+              <w:shd w:val="clear" w:color="auto" w:fill="BDD7EE"/>
+            </w:pPr>
+            <w:r>
+              <w:rPr>
+                <w:rFonts w:ascii="Calibri" w:hAnsi="Calibri"/>
+                <w:b/>
+                <w:sz w:val="20"/>
+              </w:rPr>
+              <w:t>Effect</w:t>
+            </w:r>
+          </w:p>
+        </w:tc>
+      </w:tr>
+      <w:tr>
+        <w:tc>
+          <w:tcPr>
+            <w:tcW w:type="dxa" w:w="680"/>
+          </w:tcPr>
+          <w:p>
+            <w:r>
+              <w:rPr>
+                <w:rFonts w:ascii="Courier New" w:hAnsi="Courier New"/>
+                <w:sz w:val="18"/>
+              </w:rPr>
+              <w:t>s</w:t>
+            </w:r>
+          </w:p>
+        </w:tc>
+        <w:tc>
+          <w:tcPr>
+            <w:tcW w:type="dxa" w:w="1020"/>
+          </w:tcPr>
+          <w:p>
+            <w:r>
+              <w:rPr>
+                <w:rFonts w:ascii="Courier New" w:hAnsi="Courier New"/>
+                <w:sz w:val="18"/>
+              </w:rPr>
+              <w:t>set</w:t>
+            </w:r>
+          </w:p>
+        </w:tc>
+        <w:tc>
+          <w:tcPr>
+            <w:tcW w:type="dxa" w:w="2835"/>
+          </w:tcPr>
+          <w:p>
+            <w:r>
+              <w:rPr>
+                <w:rFonts w:ascii="Courier New" w:hAnsi="Courier New"/>
+                <w:sz w:val="18"/>
+              </w:rPr>
+              <w:t>k s hamqth &lt;user&gt; &lt;pass&gt;</w:t>
+            </w:r>
+          </w:p>
+        </w:tc>
+        <w:tc>
+          <w:tcPr>
+            <w:tcW w:type="dxa" w:w="4535"/>
+          </w:tcPr>
+          <w:p>
+            <w:r>
+              <w:rPr>
+                <w:rFonts w:ascii="Calibri" w:hAnsi="Calibri"/>
+                <w:sz w:val="20"/>
+              </w:rPr>
+              <w:t>Store HamQTH credentials</w:t>
+            </w:r>
+          </w:p>
+        </w:tc>
+      </w:tr>
+      <w:tr>
+        <w:tc>
+          <w:tcPr>
+            <w:tcW w:type="dxa" w:w="680"/>
+          </w:tcPr>
+          <w:p>
+            <w:r>
+              <w:rPr>
+                <w:rFonts w:ascii="Courier New" w:hAnsi="Courier New"/>
+                <w:sz w:val="18"/>
+              </w:rPr>
+              <w:t>s</w:t>
+            </w:r>
+          </w:p>
+        </w:tc>
+        <w:tc>
+          <w:tcPr>
+            <w:tcW w:type="dxa" w:w="1020"/>
+          </w:tcPr>
+          <w:p>
+            <w:r>
+              <w:rPr>
+                <w:rFonts w:ascii="Courier New" w:hAnsi="Courier New"/>
+                <w:sz w:val="18"/>
+              </w:rPr>
+              <w:t>set</w:t>
+            </w:r>
+          </w:p>
+        </w:tc>
+        <w:tc>
+          <w:tcPr>
+            <w:tcW w:type="dxa" w:w="2835"/>
+          </w:tcPr>
+          <w:p>
+            <w:r>
+              <w:rPr>
+                <w:rFonts w:ascii="Courier New" w:hAnsi="Courier New"/>
+                <w:sz w:val="18"/>
+              </w:rPr>
+              <w:t>k s qrz &lt;user&gt; &lt;pass&gt;</w:t>
+            </w:r>
+          </w:p>
+        </w:tc>
+        <w:tc>
+          <w:tcPr>
+            <w:tcW w:type="dxa" w:w="4535"/>
+          </w:tcPr>
+          <w:p>
+            <w:r>
+              <w:rPr>
+                <w:rFonts w:ascii="Calibri" w:hAnsi="Calibri"/>
+                <w:sz w:val="20"/>
+              </w:rPr>
+              <w:t>Store QRZ.com credentials</w:t>
+            </w:r>
+          </w:p>
+        </w:tc>
+      </w:tr>
+      <w:tr>
+        <w:tc>
+          <w:tcPr>
+            <w:tcW w:type="dxa" w:w="680"/>
+          </w:tcPr>
+          <w:p>
+            <w:r>
+              <w:rPr>
+                <w:rFonts w:ascii="Courier New" w:hAnsi="Courier New"/>
+                <w:sz w:val="18"/>
+              </w:rPr>
+              <w:t>sh</w:t>
+            </w:r>
+          </w:p>
+        </w:tc>
+        <w:tc>
+          <w:tcPr>
+            <w:tcW w:type="dxa" w:w="1020"/>
+          </w:tcPr>
+          <w:p>
+            <w:r>
+              <w:rPr>
+                <w:rFonts w:ascii="Courier New" w:hAnsi="Courier New"/>
+                <w:sz w:val="18"/>
+              </w:rPr>
+              <w:t>show</w:t>
+            </w:r>
+          </w:p>
+        </w:tc>
+        <w:tc>
+          <w:tcPr>
+            <w:tcW w:type="dxa" w:w="2835"/>
+          </w:tcPr>
+          <w:p>
+            <w:r>
+              <w:rPr>
+                <w:rFonts w:ascii="Courier New" w:hAnsi="Courier New"/>
+                <w:sz w:val="18"/>
+              </w:rPr>
+              <w:t>k sh</w:t>
+            </w:r>
+          </w:p>
+        </w:tc>
+        <w:tc>
+          <w:tcPr>
+            <w:tcW w:type="dxa" w:w="4535"/>
+          </w:tcPr>
+          <w:p>
+            <w:r>
+              <w:rPr>
+                <w:rFonts w:ascii="Calibri" w:hAnsi="Calibri"/>
+                <w:sz w:val="20"/>
+              </w:rPr>
+              <w:t>Show which services are configured</w:t>
+            </w:r>
+          </w:p>
+        </w:tc>
+      </w:tr>
+    </w:tbl>
+    <w:p>
+      <w:pPr>
+        <w:spacing w:before="0" w:after="80"/>
+      </w:pPr>
+    </w:p>
+    <w:p>
+      <w:pPr>
+        <w:pStyle w:val="Heading2"/>
+        <w:spacing w:before="160" w:after="80"/>
+      </w:pPr>
+      <w:r>
+        <w:t>13.3  Worked Example — Full Session Using Aliases</w:t>
+      </w:r>
+    </w:p>
+    <w:p>
+      <w:pPr>
+        <w:spacing w:before="0" w:after="80"/>
+      </w:pPr>
+      <w:r>
+        <w:rPr>
+          <w:rFonts w:ascii="Calibri" w:hAnsi="Calibri"/>
+          <w:sz w:val="22"/>
+        </w:rPr>
+        <w:t>The following illustrates a typical operating session using only short forms:</w:t>
+      </w:r>
+    </w:p>
+    <w:p>
+      <w:pPr>
+        <w:shd w:val="clear" w:color="auto" w:fill="DDEEFF"/>
+        <w:spacing w:before="40" w:after="40"/>
+        <w:ind w:left="360"/>
+      </w:pPr>
+      <w:r>
+        <w:rPr>
+          <w:rFonts w:ascii="Courier New" w:hAnsi="Courier New"/>
+          <w:sz w:val="18"/>
+        </w:rPr>
+        <w:t>c dxsummit G0ABC     # connect to DX Summit cluster as G0ABC</w:t>
+        <w:br/>
+        <w:t>s                    # start streaming spots</w:t>
+        <w:br/>
+        <w:t>f b 20m              # filter to 20m only</w:t>
+        <w:br/>
+        <w:t>f m FT8              # add FT8 mode filter</w:t>
+        <w:br/>
+        <w:t>/ p VK               # search for all Australian spots in last 24h</w:t>
+        <w:br/>
+        <w:t>k VK3IO              # look up VK3IO on HamQTH</w:t>
+        <w:br/>
+        <w:t>u GM3WOJ             # offline DXCC check for GM3WOJ</w:t>
+        <w:br/>
+        <w:t>w VK3IO              # mark VK3IO as worked</w:t>
+        <w:br/>
+        <w:t>f c                  # clear all filters to see everything</w:t>
+        <w:br/>
+        <w:t>v                    # save settings</w:t>
+        <w:br/>
+        <w:t>q                    # quit</w:t>
+      </w:r>
+    </w:p>
     <w:sectPr>
       <w:pgSz w:w="12240" w:h="15840"/>
       <w:pgMar w:top="1417" w:right="1417" w:bottom="1417" w:left="1417" w:header="720" w:footer="720" w:gutter="0"/>

</xml_diff>